<commit_message>
Add: Final selection list docx after removing items 7, 30, 35, 42
</commit_message>
<xml_diff>
--- a/성경통독일기장_선택링크_가나다순.docx
+++ b/성경통독일기장_선택링크_가나다순.docx
@@ -12,7 +12,7 @@
           <w:b/>
           <w:sz w:val="32"/>
         </w:rPr>
-        <w:t>📖 성경통독일기장 전용 접속 링크 리스트 (가나다순)</w:t>
+        <w:t>📖 성경통독일기장 전용 접속 링크 리스트 (최종 가나다순)</w:t>
       </w:r>
     </w:p>
     <w:p>
@@ -363,7 +363,7 @@
               <w:rPr>
                 <w:rFonts w:ascii="Malgun Gothic" w:hAnsi="Malgun Gothic"/>
               </w:rPr>
-              <w:t>김순희 집사</w:t>
+              <w:t>김시웅 권사</w:t>
             </w:r>
           </w:p>
         </w:tc>
@@ -378,7 +378,7 @@
                   <w:color w:val="0000FF"/>
                   <w:u w:val="single"/>
                 </w:rPr>
-                <w:t>https://loginchurch.vercel.app/soonhee</w:t>
+                <w:t>https://loginchurch.vercel.app/siwoong</w:t>
               </w:r>
             </w:hyperlink>
           </w:p>
@@ -422,7 +422,7 @@
                   <w:color w:val="0000FF"/>
                   <w:u w:val="single"/>
                 </w:rPr>
-                <w:t>https://loginchurch.vercel.app/siwoong</w:t>
+                <w:t>https://loginchurch.vercel.app/kimsiwoong</w:t>
               </w:r>
             </w:hyperlink>
           </w:p>
@@ -451,7 +451,7 @@
               <w:rPr>
                 <w:rFonts w:ascii="Malgun Gothic" w:hAnsi="Malgun Gothic"/>
               </w:rPr>
-              <w:t>김시웅 권사</w:t>
+              <w:t>김은정 권사</w:t>
             </w:r>
           </w:p>
         </w:tc>
@@ -466,7 +466,7 @@
                   <w:color w:val="0000FF"/>
                   <w:u w:val="single"/>
                 </w:rPr>
-                <w:t>https://loginchurch.vercel.app/kimsiwoong</w:t>
+                <w:t>https://loginchurch.vercel.app/eunjung</w:t>
               </w:r>
             </w:hyperlink>
           </w:p>
@@ -495,7 +495,7 @@
               <w:rPr>
                 <w:rFonts w:ascii="Malgun Gothic" w:hAnsi="Malgun Gothic"/>
               </w:rPr>
-              <w:t>김은정 권사</w:t>
+              <w:t>김준태 성도</w:t>
             </w:r>
           </w:p>
         </w:tc>
@@ -510,7 +510,7 @@
                   <w:color w:val="0000FF"/>
                   <w:u w:val="single"/>
                 </w:rPr>
-                <w:t>https://loginchurch.vercel.app/eunjung</w:t>
+                <w:t>https://loginchurch.vercel.app/juntae</w:t>
               </w:r>
             </w:hyperlink>
           </w:p>
@@ -539,7 +539,7 @@
               <w:rPr>
                 <w:rFonts w:ascii="Malgun Gothic" w:hAnsi="Malgun Gothic"/>
               </w:rPr>
-              <w:t>김준태 성도</w:t>
+              <w:t>김지윤 권사</w:t>
             </w:r>
           </w:p>
         </w:tc>
@@ -554,7 +554,7 @@
                   <w:color w:val="0000FF"/>
                   <w:u w:val="single"/>
                 </w:rPr>
-                <w:t>https://loginchurch.vercel.app/juntae</w:t>
+                <w:t>https://loginchurch.vercel.app/jiyoon</w:t>
               </w:r>
             </w:hyperlink>
           </w:p>
@@ -583,7 +583,7 @@
               <w:rPr>
                 <w:rFonts w:ascii="Malgun Gothic" w:hAnsi="Malgun Gothic"/>
               </w:rPr>
-              <w:t>김지윤 권사</w:t>
+              <w:t>김진영 권사</w:t>
             </w:r>
           </w:p>
         </w:tc>
@@ -598,7 +598,7 @@
                   <w:color w:val="0000FF"/>
                   <w:u w:val="single"/>
                 </w:rPr>
-                <w:t>https://loginchurch.vercel.app/jiyoon</w:t>
+                <w:t>https://loginchurch.vercel.app/jinyoung</w:t>
               </w:r>
             </w:hyperlink>
           </w:p>
@@ -627,7 +627,7 @@
               <w:rPr>
                 <w:rFonts w:ascii="Malgun Gothic" w:hAnsi="Malgun Gothic"/>
               </w:rPr>
-              <w:t>김진영 권사</w:t>
+              <w:t>김태희 집사</w:t>
             </w:r>
           </w:p>
         </w:tc>
@@ -642,7 +642,7 @@
                   <w:color w:val="0000FF"/>
                   <w:u w:val="single"/>
                 </w:rPr>
-                <w:t>https://loginchurch.vercel.app/jinyoung</w:t>
+                <w:t>https://loginchurch.vercel.app/taehee</w:t>
               </w:r>
             </w:hyperlink>
           </w:p>
@@ -671,7 +671,7 @@
               <w:rPr>
                 <w:rFonts w:ascii="Malgun Gothic" w:hAnsi="Malgun Gothic"/>
               </w:rPr>
-              <w:t>김태희 집사</w:t>
+              <w:t>김혜경 성도</w:t>
             </w:r>
           </w:p>
         </w:tc>
@@ -686,7 +686,7 @@
                   <w:color w:val="0000FF"/>
                   <w:u w:val="single"/>
                 </w:rPr>
-                <w:t>https://loginchurch.vercel.app/taehee</w:t>
+                <w:t>https://loginchurch.vercel.app/hyekyung</w:t>
               </w:r>
             </w:hyperlink>
           </w:p>
@@ -715,7 +715,7 @@
               <w:rPr>
                 <w:rFonts w:ascii="Malgun Gothic" w:hAnsi="Malgun Gothic"/>
               </w:rPr>
-              <w:t>김혜경 성도</w:t>
+              <w:t>나정훈 권사</w:t>
             </w:r>
           </w:p>
         </w:tc>
@@ -730,7 +730,7 @@
                   <w:color w:val="0000FF"/>
                   <w:u w:val="single"/>
                 </w:rPr>
-                <w:t>https://loginchurch.vercel.app/hyekyung</w:t>
+                <w:t>https://loginchurch.vercel.app/junghoon</w:t>
               </w:r>
             </w:hyperlink>
           </w:p>
@@ -759,7 +759,7 @@
               <w:rPr>
                 <w:rFonts w:ascii="Malgun Gothic" w:hAnsi="Malgun Gothic"/>
               </w:rPr>
-              <w:t>나정훈 권사</w:t>
+              <w:t>마은경 집사</w:t>
             </w:r>
           </w:p>
         </w:tc>
@@ -774,7 +774,7 @@
                   <w:color w:val="0000FF"/>
                   <w:u w:val="single"/>
                 </w:rPr>
-                <w:t>https://loginchurch.vercel.app/junghoon</w:t>
+                <w:t>https://loginchurch.vercel.app/eunkyung</w:t>
               </w:r>
             </w:hyperlink>
           </w:p>
@@ -803,7 +803,7 @@
               <w:rPr>
                 <w:rFonts w:ascii="Malgun Gothic" w:hAnsi="Malgun Gothic"/>
               </w:rPr>
-              <w:t>마은경 집사</w:t>
+              <w:t>박지현 집사</w:t>
             </w:r>
           </w:p>
         </w:tc>
@@ -818,7 +818,7 @@
                   <w:color w:val="0000FF"/>
                   <w:u w:val="single"/>
                 </w:rPr>
-                <w:t>https://loginchurch.vercel.app/eunkyung</w:t>
+                <w:t>https://loginchurch.vercel.app/jihyun</w:t>
               </w:r>
             </w:hyperlink>
           </w:p>
@@ -847,7 +847,7 @@
               <w:rPr>
                 <w:rFonts w:ascii="Malgun Gothic" w:hAnsi="Malgun Gothic"/>
               </w:rPr>
-              <w:t>박지현 집사</w:t>
+              <w:t>박현자 집사</w:t>
             </w:r>
           </w:p>
         </w:tc>
@@ -862,7 +862,7 @@
                   <w:color w:val="0000FF"/>
                   <w:u w:val="single"/>
                 </w:rPr>
-                <w:t>https://loginchurch.vercel.app/jihyun</w:t>
+                <w:t>https://loginchurch.vercel.app/Elaine</w:t>
               </w:r>
             </w:hyperlink>
           </w:p>
@@ -891,7 +891,7 @@
               <w:rPr>
                 <w:rFonts w:ascii="Malgun Gothic" w:hAnsi="Malgun Gothic"/>
               </w:rPr>
-              <w:t>박현자 집사</w:t>
+              <w:t>서주희 성도</w:t>
             </w:r>
           </w:p>
         </w:tc>
@@ -906,7 +906,7 @@
                   <w:color w:val="0000FF"/>
                   <w:u w:val="single"/>
                 </w:rPr>
-                <w:t>https://loginchurch.vercel.app/Elaine</w:t>
+                <w:t>https://loginchurch.vercel.app/juhee</w:t>
               </w:r>
             </w:hyperlink>
           </w:p>
@@ -935,7 +935,7 @@
               <w:rPr>
                 <w:rFonts w:ascii="Malgun Gothic" w:hAnsi="Malgun Gothic"/>
               </w:rPr>
-              <w:t>서주희 성도</w:t>
+              <w:t>성경은 집사</w:t>
             </w:r>
           </w:p>
         </w:tc>
@@ -950,7 +950,7 @@
                   <w:color w:val="0000FF"/>
                   <w:u w:val="single"/>
                 </w:rPr>
-                <w:t>https://loginchurch.vercel.app/juhee</w:t>
+                <w:t>https://loginchurch.vercel.app/kyungeun</w:t>
               </w:r>
             </w:hyperlink>
           </w:p>
@@ -979,7 +979,7 @@
               <w:rPr>
                 <w:rFonts w:ascii="Malgun Gothic" w:hAnsi="Malgun Gothic"/>
               </w:rPr>
-              <w:t>성경은 집사</w:t>
+              <w:t>성한나 집사</w:t>
             </w:r>
           </w:p>
         </w:tc>
@@ -994,7 +994,7 @@
                   <w:color w:val="0000FF"/>
                   <w:u w:val="single"/>
                 </w:rPr>
-                <w:t>https://loginchurch.vercel.app/kyungeun</w:t>
+                <w:t>https://loginchurch.vercel.app/hanna</w:t>
               </w:r>
             </w:hyperlink>
           </w:p>
@@ -1023,7 +1023,7 @@
               <w:rPr>
                 <w:rFonts w:ascii="Malgun Gothic" w:hAnsi="Malgun Gothic"/>
               </w:rPr>
-              <w:t>성한나 집사</w:t>
+              <w:t>손수현 성도</w:t>
             </w:r>
           </w:p>
         </w:tc>
@@ -1038,7 +1038,7 @@
                   <w:color w:val="0000FF"/>
                   <w:u w:val="single"/>
                 </w:rPr>
-                <w:t>https://loginchurch.vercel.app/hanna</w:t>
+                <w:t>https://loginchurch.vercel.app/suhyun</w:t>
               </w:r>
             </w:hyperlink>
           </w:p>
@@ -1067,7 +1067,7 @@
               <w:rPr>
                 <w:rFonts w:ascii="Malgun Gothic" w:hAnsi="Malgun Gothic"/>
               </w:rPr>
-              <w:t>손수현 성도</w:t>
+              <w:t>심은혜 성도</w:t>
             </w:r>
           </w:p>
         </w:tc>
@@ -1082,7 +1082,7 @@
                   <w:color w:val="0000FF"/>
                   <w:u w:val="single"/>
                 </w:rPr>
-                <w:t>https://loginchurch.vercel.app/suhyun</w:t>
+                <w:t>https://loginchurch.vercel.app/eunhye</w:t>
               </w:r>
             </w:hyperlink>
           </w:p>
@@ -1111,7 +1111,7 @@
               <w:rPr>
                 <w:rFonts w:ascii="Malgun Gothic" w:hAnsi="Malgun Gothic"/>
               </w:rPr>
-              <w:t>심은혜 성도</w:t>
+              <w:t>안성희 권사</w:t>
             </w:r>
           </w:p>
         </w:tc>
@@ -1126,7 +1126,7 @@
                   <w:color w:val="0000FF"/>
                   <w:u w:val="single"/>
                 </w:rPr>
-                <w:t>https://loginchurch.vercel.app/eunhye</w:t>
+                <w:t>https://loginchurch.vercel.app/sunghee</w:t>
               </w:r>
             </w:hyperlink>
           </w:p>
@@ -1155,7 +1155,7 @@
               <w:rPr>
                 <w:rFonts w:ascii="Malgun Gothic" w:hAnsi="Malgun Gothic"/>
               </w:rPr>
-              <w:t>안성희 권사</w:t>
+              <w:t>윤정희 성도</w:t>
             </w:r>
           </w:p>
         </w:tc>
@@ -1170,7 +1170,7 @@
                   <w:color w:val="0000FF"/>
                   <w:u w:val="single"/>
                 </w:rPr>
-                <w:t>https://loginchurch.vercel.app/sunghee</w:t>
+                <w:t>https://loginchurch.vercel.app/junghee</w:t>
               </w:r>
             </w:hyperlink>
           </w:p>
@@ -1199,7 +1199,7 @@
               <w:rPr>
                 <w:rFonts w:ascii="Malgun Gothic" w:hAnsi="Malgun Gothic"/>
               </w:rPr>
-              <w:t>윤정희 성도</w:t>
+              <w:t>윤혜진 성도</w:t>
             </w:r>
           </w:p>
         </w:tc>
@@ -1214,7 +1214,7 @@
                   <w:color w:val="0000FF"/>
                   <w:u w:val="single"/>
                 </w:rPr>
-                <w:t>https://loginchurch.vercel.app/junghee</w:t>
+                <w:t>https://loginchurch.vercel.app/hyejin</w:t>
               </w:r>
             </w:hyperlink>
           </w:p>
@@ -1243,7 +1243,7 @@
               <w:rPr>
                 <w:rFonts w:ascii="Malgun Gothic" w:hAnsi="Malgun Gothic"/>
               </w:rPr>
-              <w:t>윤혜진 성도</w:t>
+              <w:t>이성아 집사</w:t>
             </w:r>
           </w:p>
         </w:tc>
@@ -1258,7 +1258,7 @@
                   <w:color w:val="0000FF"/>
                   <w:u w:val="single"/>
                 </w:rPr>
-                <w:t>https://loginchurch.vercel.app/hyejin</w:t>
+                <w:t>https://loginchurch.vercel.app/sunga</w:t>
               </w:r>
             </w:hyperlink>
           </w:p>
@@ -1287,7 +1287,7 @@
               <w:rPr>
                 <w:rFonts w:ascii="Malgun Gothic" w:hAnsi="Malgun Gothic"/>
               </w:rPr>
-              <w:t>이성아 집사</w:t>
+              <w:t>이수진 권사</w:t>
             </w:r>
           </w:p>
         </w:tc>
@@ -1302,7 +1302,7 @@
                   <w:color w:val="0000FF"/>
                   <w:u w:val="single"/>
                 </w:rPr>
-                <w:t>https://loginchurch.vercel.app/sunga</w:t>
+                <w:t>https://loginchurch.vercel.app/soojin</w:t>
               </w:r>
             </w:hyperlink>
           </w:p>
@@ -1331,7 +1331,7 @@
               <w:rPr>
                 <w:rFonts w:ascii="Malgun Gothic" w:hAnsi="Malgun Gothic"/>
               </w:rPr>
-              <w:t>이수진 권사</w:t>
+              <w:t>이은아 집사</w:t>
             </w:r>
           </w:p>
         </w:tc>
@@ -1346,7 +1346,7 @@
                   <w:color w:val="0000FF"/>
                   <w:u w:val="single"/>
                 </w:rPr>
-                <w:t>https://loginchurch.vercel.app/soojin</w:t>
+                <w:t>https://loginchurch.vercel.app/Eunah</w:t>
               </w:r>
             </w:hyperlink>
           </w:p>
@@ -1375,7 +1375,7 @@
               <w:rPr>
                 <w:rFonts w:ascii="Malgun Gothic" w:hAnsi="Malgun Gothic"/>
               </w:rPr>
-              <w:t>이수진 권사</w:t>
+              <w:t>이지선 집사</w:t>
             </w:r>
           </w:p>
         </w:tc>
@@ -1390,7 +1390,7 @@
                   <w:color w:val="0000FF"/>
                   <w:u w:val="single"/>
                 </w:rPr>
-                <w:t>https://loginchurch.vercel.app/sujin</w:t>
+                <w:t>https://loginchurch.vercel.app/ezsun</w:t>
               </w:r>
             </w:hyperlink>
           </w:p>
@@ -1419,7 +1419,7 @@
               <w:rPr>
                 <w:rFonts w:ascii="Malgun Gothic" w:hAnsi="Malgun Gothic"/>
               </w:rPr>
-              <w:t>이은아 집사</w:t>
+              <w:t>임금님 집사</w:t>
             </w:r>
           </w:p>
         </w:tc>
@@ -1434,7 +1434,7 @@
                   <w:color w:val="0000FF"/>
                   <w:u w:val="single"/>
                 </w:rPr>
-                <w:t>https://loginchurch.vercel.app/Eunah</w:t>
+                <w:t>https://loginchurch.vercel.app/geumnim</w:t>
               </w:r>
             </w:hyperlink>
           </w:p>
@@ -1463,7 +1463,7 @@
               <w:rPr>
                 <w:rFonts w:ascii="Malgun Gothic" w:hAnsi="Malgun Gothic"/>
               </w:rPr>
-              <w:t>이지선 집사</w:t>
+              <w:t>임혜인 사모</w:t>
             </w:r>
           </w:p>
         </w:tc>
@@ -1478,7 +1478,7 @@
                   <w:color w:val="0000FF"/>
                   <w:u w:val="single"/>
                 </w:rPr>
-                <w:t>https://loginchurch.vercel.app/ezsun</w:t>
+                <w:t>https://loginchurch.vercel.app/hyein</w:t>
               </w:r>
             </w:hyperlink>
           </w:p>
@@ -1507,7 +1507,7 @@
               <w:rPr>
                 <w:rFonts w:ascii="Malgun Gothic" w:hAnsi="Malgun Gothic"/>
               </w:rPr>
-              <w:t>임금님 집사</w:t>
+              <w:t>장성주 집사</w:t>
             </w:r>
           </w:p>
         </w:tc>
@@ -1522,7 +1522,7 @@
                   <w:color w:val="0000FF"/>
                   <w:u w:val="single"/>
                 </w:rPr>
-                <w:t>https://loginchurch.vercel.app/geumnim</w:t>
+                <w:t>https://loginchurch.vercel.app/sungju</w:t>
               </w:r>
             </w:hyperlink>
           </w:p>
@@ -1551,7 +1551,7 @@
               <w:rPr>
                 <w:rFonts w:ascii="Malgun Gothic" w:hAnsi="Malgun Gothic"/>
               </w:rPr>
-              <w:t>임혜인 사모</w:t>
+              <w:t>장예주 성도</w:t>
             </w:r>
           </w:p>
         </w:tc>
@@ -1566,7 +1566,7 @@
                   <w:color w:val="0000FF"/>
                   <w:u w:val="single"/>
                 </w:rPr>
-                <w:t>https://loginchurch.vercel.app/hyein</w:t>
+                <w:t>https://loginchurch.vercel.app/yeju</w:t>
               </w:r>
             </w:hyperlink>
           </w:p>
@@ -1595,7 +1595,7 @@
               <w:rPr>
                 <w:rFonts w:ascii="Malgun Gothic" w:hAnsi="Malgun Gothic"/>
               </w:rPr>
-              <w:t>장성주 집사</w:t>
+              <w:t>조성환 권사</w:t>
             </w:r>
           </w:p>
         </w:tc>
@@ -1610,7 +1610,7 @@
                   <w:color w:val="0000FF"/>
                   <w:u w:val="single"/>
                 </w:rPr>
-                <w:t>https://loginchurch.vercel.app/sungjoo</w:t>
+                <w:t>https://loginchurch.vercel.app/sunghwan</w:t>
               </w:r>
             </w:hyperlink>
           </w:p>
@@ -1639,7 +1639,7 @@
               <w:rPr>
                 <w:rFonts w:ascii="Malgun Gothic" w:hAnsi="Malgun Gothic"/>
               </w:rPr>
-              <w:t>장성주 집사</w:t>
+              <w:t>조이 성도</w:t>
             </w:r>
           </w:p>
         </w:tc>
@@ -1654,7 +1654,7 @@
                   <w:color w:val="0000FF"/>
                   <w:u w:val="single"/>
                 </w:rPr>
-                <w:t>https://loginchurch.vercel.app/sungju</w:t>
+                <w:t>https://loginchurch.vercel.app/joy</w:t>
               </w:r>
             </w:hyperlink>
           </w:p>
@@ -1683,7 +1683,7 @@
               <w:rPr>
                 <w:rFonts w:ascii="Malgun Gothic" w:hAnsi="Malgun Gothic"/>
               </w:rPr>
-              <w:t>장예주 성도</w:t>
+              <w:t>최지혜 집사</w:t>
             </w:r>
           </w:p>
         </w:tc>
@@ -1698,7 +1698,7 @@
                   <w:color w:val="0000FF"/>
                   <w:u w:val="single"/>
                 </w:rPr>
-                <w:t>https://loginchurch.vercel.app/yeju</w:t>
+                <w:t>https://loginchurch.vercel.app/jihye</w:t>
               </w:r>
             </w:hyperlink>
           </w:p>
@@ -1727,7 +1727,7 @@
               <w:rPr>
                 <w:rFonts w:ascii="Malgun Gothic" w:hAnsi="Malgun Gothic"/>
               </w:rPr>
-              <w:t>조성환 권사</w:t>
+              <w:t>최현경 권사</w:t>
             </w:r>
           </w:p>
         </w:tc>
@@ -1742,183 +1742,7 @@
                   <w:color w:val="0000FF"/>
                   <w:u w:val="single"/>
                 </w:rPr>
-                <w:t>https://loginchurch.vercel.app/sunghwan</w:t>
-              </w:r>
-            </w:hyperlink>
-          </w:p>
-        </w:tc>
-      </w:tr>
-      <w:tr>
-        <w:tc>
-          <w:tcPr>
-            <w:tcW w:type="dxa" w:w="2880"/>
-          </w:tcPr>
-          <w:p>
-            <w:r>
-              <w:rPr>
-                <w:rFonts w:ascii="Malgun Gothic" w:hAnsi="Malgun Gothic"/>
-              </w:rPr>
-              <w:t>39</w:t>
-            </w:r>
-          </w:p>
-        </w:tc>
-        <w:tc>
-          <w:tcPr>
-            <w:tcW w:type="dxa" w:w="2880"/>
-          </w:tcPr>
-          <w:p>
-            <w:r>
-              <w:rPr>
-                <w:rFonts w:ascii="Malgun Gothic" w:hAnsi="Malgun Gothic"/>
-              </w:rPr>
-              <w:t>조이 성도</w:t>
-            </w:r>
-          </w:p>
-        </w:tc>
-        <w:tc>
-          <w:tcPr>
-            <w:tcW w:type="dxa" w:w="2880"/>
-          </w:tcPr>
-          <w:p>
-            <w:hyperlink r:id="rId47">
-              <w:r>
-                <w:rPr>
-                  <w:color w:val="0000FF"/>
-                  <w:u w:val="single"/>
-                </w:rPr>
-                <w:t>https://loginchurch.vercel.app/joy</w:t>
-              </w:r>
-            </w:hyperlink>
-          </w:p>
-        </w:tc>
-      </w:tr>
-      <w:tr>
-        <w:tc>
-          <w:tcPr>
-            <w:tcW w:type="dxa" w:w="2880"/>
-          </w:tcPr>
-          <w:p>
-            <w:r>
-              <w:rPr>
-                <w:rFonts w:ascii="Malgun Gothic" w:hAnsi="Malgun Gothic"/>
-              </w:rPr>
-              <w:t>40</w:t>
-            </w:r>
-          </w:p>
-        </w:tc>
-        <w:tc>
-          <w:tcPr>
-            <w:tcW w:type="dxa" w:w="2880"/>
-          </w:tcPr>
-          <w:p>
-            <w:r>
-              <w:rPr>
-                <w:rFonts w:ascii="Malgun Gothic" w:hAnsi="Malgun Gothic"/>
-              </w:rPr>
-              <w:t>최지혜 집사</w:t>
-            </w:r>
-          </w:p>
-        </w:tc>
-        <w:tc>
-          <w:tcPr>
-            <w:tcW w:type="dxa" w:w="2880"/>
-          </w:tcPr>
-          <w:p>
-            <w:hyperlink r:id="rId48">
-              <w:r>
-                <w:rPr>
-                  <w:color w:val="0000FF"/>
-                  <w:u w:val="single"/>
-                </w:rPr>
-                <w:t>https://loginchurch.vercel.app/jihye</w:t>
-              </w:r>
-            </w:hyperlink>
-          </w:p>
-        </w:tc>
-      </w:tr>
-      <w:tr>
-        <w:tc>
-          <w:tcPr>
-            <w:tcW w:type="dxa" w:w="2880"/>
-          </w:tcPr>
-          <w:p>
-            <w:r>
-              <w:rPr>
-                <w:rFonts w:ascii="Malgun Gothic" w:hAnsi="Malgun Gothic"/>
-              </w:rPr>
-              <w:t>41</w:t>
-            </w:r>
-          </w:p>
-        </w:tc>
-        <w:tc>
-          <w:tcPr>
-            <w:tcW w:type="dxa" w:w="2880"/>
-          </w:tcPr>
-          <w:p>
-            <w:r>
-              <w:rPr>
-                <w:rFonts w:ascii="Malgun Gothic" w:hAnsi="Malgun Gothic"/>
-              </w:rPr>
-              <w:t>최현경 권사</w:t>
-            </w:r>
-          </w:p>
-        </w:tc>
-        <w:tc>
-          <w:tcPr>
-            <w:tcW w:type="dxa" w:w="2880"/>
-          </w:tcPr>
-          <w:p>
-            <w:hyperlink r:id="rId49">
-              <w:r>
-                <w:rPr>
-                  <w:color w:val="0000FF"/>
-                  <w:u w:val="single"/>
-                </w:rPr>
                 <w:t>https://loginchurch.vercel.app/hyunkyung</w:t>
-              </w:r>
-            </w:hyperlink>
-          </w:p>
-        </w:tc>
-      </w:tr>
-      <w:tr>
-        <w:tc>
-          <w:tcPr>
-            <w:tcW w:type="dxa" w:w="2880"/>
-          </w:tcPr>
-          <w:p>
-            <w:r>
-              <w:rPr>
-                <w:rFonts w:ascii="Malgun Gothic" w:hAnsi="Malgun Gothic"/>
-              </w:rPr>
-              <w:t>42</w:t>
-            </w:r>
-          </w:p>
-        </w:tc>
-        <w:tc>
-          <w:tcPr>
-            <w:tcW w:type="dxa" w:w="2880"/>
-          </w:tcPr>
-          <w:p>
-            <w:r>
-              <w:rPr>
-                <w:rFonts w:ascii="Malgun Gothic" w:hAnsi="Malgun Gothic"/>
-              </w:rPr>
-              <w:t>최현경 권사</w:t>
-            </w:r>
-          </w:p>
-        </w:tc>
-        <w:tc>
-          <w:tcPr>
-            <w:tcW w:type="dxa" w:w="2880"/>
-          </w:tcPr>
-          <w:p>
-            <w:hyperlink r:id="rId50">
-              <w:r>
-                <w:rPr>
-                  <w:color w:val="0000FF"/>
-                  <w:u w:val="single"/>
-                </w:rPr>
-                <w:t>https://loginchurch.vercel.app/choi</w:t>
               </w:r>
             </w:hyperlink>
           </w:p>

</xml_diff>

<commit_message>
Add: Final selection list docx after removing kimsiwoong (item 8)
</commit_message>
<xml_diff>
--- a/성경통독일기장_선택링크_가나다순.docx
+++ b/성경통독일기장_선택링크_가나다순.docx
@@ -407,7 +407,7 @@
               <w:rPr>
                 <w:rFonts w:ascii="Malgun Gothic" w:hAnsi="Malgun Gothic"/>
               </w:rPr>
-              <w:t>김시웅 권사</w:t>
+              <w:t>김은정 권사</w:t>
             </w:r>
           </w:p>
         </w:tc>
@@ -422,7 +422,7 @@
                   <w:color w:val="0000FF"/>
                   <w:u w:val="single"/>
                 </w:rPr>
-                <w:t>https://loginchurch.vercel.app/kimsiwoong</w:t>
+                <w:t>https://loginchurch.vercel.app/eunjung</w:t>
               </w:r>
             </w:hyperlink>
           </w:p>
@@ -451,7 +451,7 @@
               <w:rPr>
                 <w:rFonts w:ascii="Malgun Gothic" w:hAnsi="Malgun Gothic"/>
               </w:rPr>
-              <w:t>김은정 권사</w:t>
+              <w:t>김준태 성도</w:t>
             </w:r>
           </w:p>
         </w:tc>
@@ -466,7 +466,7 @@
                   <w:color w:val="0000FF"/>
                   <w:u w:val="single"/>
                 </w:rPr>
-                <w:t>https://loginchurch.vercel.app/eunjung</w:t>
+                <w:t>https://loginchurch.vercel.app/juntae</w:t>
               </w:r>
             </w:hyperlink>
           </w:p>
@@ -495,7 +495,7 @@
               <w:rPr>
                 <w:rFonts w:ascii="Malgun Gothic" w:hAnsi="Malgun Gothic"/>
               </w:rPr>
-              <w:t>김준태 성도</w:t>
+              <w:t>김지윤 권사</w:t>
             </w:r>
           </w:p>
         </w:tc>
@@ -510,7 +510,7 @@
                   <w:color w:val="0000FF"/>
                   <w:u w:val="single"/>
                 </w:rPr>
-                <w:t>https://loginchurch.vercel.app/juntae</w:t>
+                <w:t>https://loginchurch.vercel.app/jiyoon</w:t>
               </w:r>
             </w:hyperlink>
           </w:p>
@@ -539,7 +539,7 @@
               <w:rPr>
                 <w:rFonts w:ascii="Malgun Gothic" w:hAnsi="Malgun Gothic"/>
               </w:rPr>
-              <w:t>김지윤 권사</w:t>
+              <w:t>김진영 권사</w:t>
             </w:r>
           </w:p>
         </w:tc>
@@ -554,7 +554,7 @@
                   <w:color w:val="0000FF"/>
                   <w:u w:val="single"/>
                 </w:rPr>
-                <w:t>https://loginchurch.vercel.app/jiyoon</w:t>
+                <w:t>https://loginchurch.vercel.app/jinyoung</w:t>
               </w:r>
             </w:hyperlink>
           </w:p>
@@ -583,7 +583,7 @@
               <w:rPr>
                 <w:rFonts w:ascii="Malgun Gothic" w:hAnsi="Malgun Gothic"/>
               </w:rPr>
-              <w:t>김진영 권사</w:t>
+              <w:t>김태희 집사</w:t>
             </w:r>
           </w:p>
         </w:tc>
@@ -598,7 +598,7 @@
                   <w:color w:val="0000FF"/>
                   <w:u w:val="single"/>
                 </w:rPr>
-                <w:t>https://loginchurch.vercel.app/jinyoung</w:t>
+                <w:t>https://loginchurch.vercel.app/taehee</w:t>
               </w:r>
             </w:hyperlink>
           </w:p>
@@ -627,7 +627,7 @@
               <w:rPr>
                 <w:rFonts w:ascii="Malgun Gothic" w:hAnsi="Malgun Gothic"/>
               </w:rPr>
-              <w:t>김태희 집사</w:t>
+              <w:t>김혜경 성도</w:t>
             </w:r>
           </w:p>
         </w:tc>
@@ -642,7 +642,7 @@
                   <w:color w:val="0000FF"/>
                   <w:u w:val="single"/>
                 </w:rPr>
-                <w:t>https://loginchurch.vercel.app/taehee</w:t>
+                <w:t>https://loginchurch.vercel.app/hyekyung</w:t>
               </w:r>
             </w:hyperlink>
           </w:p>
@@ -671,7 +671,7 @@
               <w:rPr>
                 <w:rFonts w:ascii="Malgun Gothic" w:hAnsi="Malgun Gothic"/>
               </w:rPr>
-              <w:t>김혜경 성도</w:t>
+              <w:t>나정훈 권사</w:t>
             </w:r>
           </w:p>
         </w:tc>
@@ -686,7 +686,7 @@
                   <w:color w:val="0000FF"/>
                   <w:u w:val="single"/>
                 </w:rPr>
-                <w:t>https://loginchurch.vercel.app/hyekyung</w:t>
+                <w:t>https://loginchurch.vercel.app/junghoon</w:t>
               </w:r>
             </w:hyperlink>
           </w:p>
@@ -715,7 +715,7 @@
               <w:rPr>
                 <w:rFonts w:ascii="Malgun Gothic" w:hAnsi="Malgun Gothic"/>
               </w:rPr>
-              <w:t>나정훈 권사</w:t>
+              <w:t>마은경 집사</w:t>
             </w:r>
           </w:p>
         </w:tc>
@@ -730,7 +730,7 @@
                   <w:color w:val="0000FF"/>
                   <w:u w:val="single"/>
                 </w:rPr>
-                <w:t>https://loginchurch.vercel.app/junghoon</w:t>
+                <w:t>https://loginchurch.vercel.app/eunkyung</w:t>
               </w:r>
             </w:hyperlink>
           </w:p>
@@ -759,7 +759,7 @@
               <w:rPr>
                 <w:rFonts w:ascii="Malgun Gothic" w:hAnsi="Malgun Gothic"/>
               </w:rPr>
-              <w:t>마은경 집사</w:t>
+              <w:t>박지현 집사</w:t>
             </w:r>
           </w:p>
         </w:tc>
@@ -774,7 +774,7 @@
                   <w:color w:val="0000FF"/>
                   <w:u w:val="single"/>
                 </w:rPr>
-                <w:t>https://loginchurch.vercel.app/eunkyung</w:t>
+                <w:t>https://loginchurch.vercel.app/jihyun</w:t>
               </w:r>
             </w:hyperlink>
           </w:p>
@@ -803,7 +803,7 @@
               <w:rPr>
                 <w:rFonts w:ascii="Malgun Gothic" w:hAnsi="Malgun Gothic"/>
               </w:rPr>
-              <w:t>박지현 집사</w:t>
+              <w:t>박현자 집사</w:t>
             </w:r>
           </w:p>
         </w:tc>
@@ -818,7 +818,7 @@
                   <w:color w:val="0000FF"/>
                   <w:u w:val="single"/>
                 </w:rPr>
-                <w:t>https://loginchurch.vercel.app/jihyun</w:t>
+                <w:t>https://loginchurch.vercel.app/Elaine</w:t>
               </w:r>
             </w:hyperlink>
           </w:p>
@@ -847,7 +847,7 @@
               <w:rPr>
                 <w:rFonts w:ascii="Malgun Gothic" w:hAnsi="Malgun Gothic"/>
               </w:rPr>
-              <w:t>박현자 집사</w:t>
+              <w:t>서주희 성도</w:t>
             </w:r>
           </w:p>
         </w:tc>
@@ -862,7 +862,7 @@
                   <w:color w:val="0000FF"/>
                   <w:u w:val="single"/>
                 </w:rPr>
-                <w:t>https://loginchurch.vercel.app/Elaine</w:t>
+                <w:t>https://loginchurch.vercel.app/juhee</w:t>
               </w:r>
             </w:hyperlink>
           </w:p>
@@ -891,7 +891,7 @@
               <w:rPr>
                 <w:rFonts w:ascii="Malgun Gothic" w:hAnsi="Malgun Gothic"/>
               </w:rPr>
-              <w:t>서주희 성도</w:t>
+              <w:t>성경은 집사</w:t>
             </w:r>
           </w:p>
         </w:tc>
@@ -906,7 +906,7 @@
                   <w:color w:val="0000FF"/>
                   <w:u w:val="single"/>
                 </w:rPr>
-                <w:t>https://loginchurch.vercel.app/juhee</w:t>
+                <w:t>https://loginchurch.vercel.app/kyungeun</w:t>
               </w:r>
             </w:hyperlink>
           </w:p>
@@ -935,7 +935,7 @@
               <w:rPr>
                 <w:rFonts w:ascii="Malgun Gothic" w:hAnsi="Malgun Gothic"/>
               </w:rPr>
-              <w:t>성경은 집사</w:t>
+              <w:t>성한나 집사</w:t>
             </w:r>
           </w:p>
         </w:tc>
@@ -950,7 +950,7 @@
                   <w:color w:val="0000FF"/>
                   <w:u w:val="single"/>
                 </w:rPr>
-                <w:t>https://loginchurch.vercel.app/kyungeun</w:t>
+                <w:t>https://loginchurch.vercel.app/hanna</w:t>
               </w:r>
             </w:hyperlink>
           </w:p>
@@ -979,7 +979,7 @@
               <w:rPr>
                 <w:rFonts w:ascii="Malgun Gothic" w:hAnsi="Malgun Gothic"/>
               </w:rPr>
-              <w:t>성한나 집사</w:t>
+              <w:t>손수현 성도</w:t>
             </w:r>
           </w:p>
         </w:tc>
@@ -994,7 +994,7 @@
                   <w:color w:val="0000FF"/>
                   <w:u w:val="single"/>
                 </w:rPr>
-                <w:t>https://loginchurch.vercel.app/hanna</w:t>
+                <w:t>https://loginchurch.vercel.app/suhyun</w:t>
               </w:r>
             </w:hyperlink>
           </w:p>
@@ -1023,7 +1023,7 @@
               <w:rPr>
                 <w:rFonts w:ascii="Malgun Gothic" w:hAnsi="Malgun Gothic"/>
               </w:rPr>
-              <w:t>손수현 성도</w:t>
+              <w:t>심은혜 성도</w:t>
             </w:r>
           </w:p>
         </w:tc>
@@ -1038,7 +1038,7 @@
                   <w:color w:val="0000FF"/>
                   <w:u w:val="single"/>
                 </w:rPr>
-                <w:t>https://loginchurch.vercel.app/suhyun</w:t>
+                <w:t>https://loginchurch.vercel.app/eunhye</w:t>
               </w:r>
             </w:hyperlink>
           </w:p>
@@ -1067,7 +1067,7 @@
               <w:rPr>
                 <w:rFonts w:ascii="Malgun Gothic" w:hAnsi="Malgun Gothic"/>
               </w:rPr>
-              <w:t>심은혜 성도</w:t>
+              <w:t>안성희 권사</w:t>
             </w:r>
           </w:p>
         </w:tc>
@@ -1082,7 +1082,7 @@
                   <w:color w:val="0000FF"/>
                   <w:u w:val="single"/>
                 </w:rPr>
-                <w:t>https://loginchurch.vercel.app/eunhye</w:t>
+                <w:t>https://loginchurch.vercel.app/sunghee</w:t>
               </w:r>
             </w:hyperlink>
           </w:p>
@@ -1111,7 +1111,7 @@
               <w:rPr>
                 <w:rFonts w:ascii="Malgun Gothic" w:hAnsi="Malgun Gothic"/>
               </w:rPr>
-              <w:t>안성희 권사</w:t>
+              <w:t>윤정희 성도</w:t>
             </w:r>
           </w:p>
         </w:tc>
@@ -1126,7 +1126,7 @@
                   <w:color w:val="0000FF"/>
                   <w:u w:val="single"/>
                 </w:rPr>
-                <w:t>https://loginchurch.vercel.app/sunghee</w:t>
+                <w:t>https://loginchurch.vercel.app/junghee</w:t>
               </w:r>
             </w:hyperlink>
           </w:p>
@@ -1155,7 +1155,7 @@
               <w:rPr>
                 <w:rFonts w:ascii="Malgun Gothic" w:hAnsi="Malgun Gothic"/>
               </w:rPr>
-              <w:t>윤정희 성도</w:t>
+              <w:t>윤혜진 성도</w:t>
             </w:r>
           </w:p>
         </w:tc>
@@ -1170,7 +1170,7 @@
                   <w:color w:val="0000FF"/>
                   <w:u w:val="single"/>
                 </w:rPr>
-                <w:t>https://loginchurch.vercel.app/junghee</w:t>
+                <w:t>https://loginchurch.vercel.app/hyejin</w:t>
               </w:r>
             </w:hyperlink>
           </w:p>
@@ -1199,7 +1199,7 @@
               <w:rPr>
                 <w:rFonts w:ascii="Malgun Gothic" w:hAnsi="Malgun Gothic"/>
               </w:rPr>
-              <w:t>윤혜진 성도</w:t>
+              <w:t>이성아 집사</w:t>
             </w:r>
           </w:p>
         </w:tc>
@@ -1214,7 +1214,7 @@
                   <w:color w:val="0000FF"/>
                   <w:u w:val="single"/>
                 </w:rPr>
-                <w:t>https://loginchurch.vercel.app/hyejin</w:t>
+                <w:t>https://loginchurch.vercel.app/sunga</w:t>
               </w:r>
             </w:hyperlink>
           </w:p>
@@ -1243,7 +1243,7 @@
               <w:rPr>
                 <w:rFonts w:ascii="Malgun Gothic" w:hAnsi="Malgun Gothic"/>
               </w:rPr>
-              <w:t>이성아 집사</w:t>
+              <w:t>이수진 권사</w:t>
             </w:r>
           </w:p>
         </w:tc>
@@ -1258,7 +1258,7 @@
                   <w:color w:val="0000FF"/>
                   <w:u w:val="single"/>
                 </w:rPr>
-                <w:t>https://loginchurch.vercel.app/sunga</w:t>
+                <w:t>https://loginchurch.vercel.app/soojin</w:t>
               </w:r>
             </w:hyperlink>
           </w:p>
@@ -1287,7 +1287,7 @@
               <w:rPr>
                 <w:rFonts w:ascii="Malgun Gothic" w:hAnsi="Malgun Gothic"/>
               </w:rPr>
-              <w:t>이수진 권사</w:t>
+              <w:t>이은아 집사</w:t>
             </w:r>
           </w:p>
         </w:tc>
@@ -1302,7 +1302,7 @@
                   <w:color w:val="0000FF"/>
                   <w:u w:val="single"/>
                 </w:rPr>
-                <w:t>https://loginchurch.vercel.app/soojin</w:t>
+                <w:t>https://loginchurch.vercel.app/Eunah</w:t>
               </w:r>
             </w:hyperlink>
           </w:p>
@@ -1331,7 +1331,7 @@
               <w:rPr>
                 <w:rFonts w:ascii="Malgun Gothic" w:hAnsi="Malgun Gothic"/>
               </w:rPr>
-              <w:t>이은아 집사</w:t>
+              <w:t>이지선 집사</w:t>
             </w:r>
           </w:p>
         </w:tc>
@@ -1346,7 +1346,7 @@
                   <w:color w:val="0000FF"/>
                   <w:u w:val="single"/>
                 </w:rPr>
-                <w:t>https://loginchurch.vercel.app/Eunah</w:t>
+                <w:t>https://loginchurch.vercel.app/ezsun</w:t>
               </w:r>
             </w:hyperlink>
           </w:p>
@@ -1375,7 +1375,7 @@
               <w:rPr>
                 <w:rFonts w:ascii="Malgun Gothic" w:hAnsi="Malgun Gothic"/>
               </w:rPr>
-              <w:t>이지선 집사</w:t>
+              <w:t>임금님 집사</w:t>
             </w:r>
           </w:p>
         </w:tc>
@@ -1390,7 +1390,7 @@
                   <w:color w:val="0000FF"/>
                   <w:u w:val="single"/>
                 </w:rPr>
-                <w:t>https://loginchurch.vercel.app/ezsun</w:t>
+                <w:t>https://loginchurch.vercel.app/geumnim</w:t>
               </w:r>
             </w:hyperlink>
           </w:p>
@@ -1419,7 +1419,7 @@
               <w:rPr>
                 <w:rFonts w:ascii="Malgun Gothic" w:hAnsi="Malgun Gothic"/>
               </w:rPr>
-              <w:t>임금님 집사</w:t>
+              <w:t>임혜인 사모</w:t>
             </w:r>
           </w:p>
         </w:tc>
@@ -1434,7 +1434,7 @@
                   <w:color w:val="0000FF"/>
                   <w:u w:val="single"/>
                 </w:rPr>
-                <w:t>https://loginchurch.vercel.app/geumnim</w:t>
+                <w:t>https://loginchurch.vercel.app/hyein</w:t>
               </w:r>
             </w:hyperlink>
           </w:p>
@@ -1463,7 +1463,7 @@
               <w:rPr>
                 <w:rFonts w:ascii="Malgun Gothic" w:hAnsi="Malgun Gothic"/>
               </w:rPr>
-              <w:t>임혜인 사모</w:t>
+              <w:t>장성주 집사</w:t>
             </w:r>
           </w:p>
         </w:tc>
@@ -1478,7 +1478,7 @@
                   <w:color w:val="0000FF"/>
                   <w:u w:val="single"/>
                 </w:rPr>
-                <w:t>https://loginchurch.vercel.app/hyein</w:t>
+                <w:t>https://loginchurch.vercel.app/sungju</w:t>
               </w:r>
             </w:hyperlink>
           </w:p>
@@ -1507,7 +1507,7 @@
               <w:rPr>
                 <w:rFonts w:ascii="Malgun Gothic" w:hAnsi="Malgun Gothic"/>
               </w:rPr>
-              <w:t>장성주 집사</w:t>
+              <w:t>장예주 성도</w:t>
             </w:r>
           </w:p>
         </w:tc>
@@ -1522,7 +1522,7 @@
                   <w:color w:val="0000FF"/>
                   <w:u w:val="single"/>
                 </w:rPr>
-                <w:t>https://loginchurch.vercel.app/sungju</w:t>
+                <w:t>https://loginchurch.vercel.app/yeju</w:t>
               </w:r>
             </w:hyperlink>
           </w:p>
@@ -1551,7 +1551,7 @@
               <w:rPr>
                 <w:rFonts w:ascii="Malgun Gothic" w:hAnsi="Malgun Gothic"/>
               </w:rPr>
-              <w:t>장예주 성도</w:t>
+              <w:t>조성환 권사</w:t>
             </w:r>
           </w:p>
         </w:tc>
@@ -1566,7 +1566,7 @@
                   <w:color w:val="0000FF"/>
                   <w:u w:val="single"/>
                 </w:rPr>
-                <w:t>https://loginchurch.vercel.app/yeju</w:t>
+                <w:t>https://loginchurch.vercel.app/sunghwan</w:t>
               </w:r>
             </w:hyperlink>
           </w:p>
@@ -1595,7 +1595,7 @@
               <w:rPr>
                 <w:rFonts w:ascii="Malgun Gothic" w:hAnsi="Malgun Gothic"/>
               </w:rPr>
-              <w:t>조성환 권사</w:t>
+              <w:t>조이 성도</w:t>
             </w:r>
           </w:p>
         </w:tc>
@@ -1610,7 +1610,7 @@
                   <w:color w:val="0000FF"/>
                   <w:u w:val="single"/>
                 </w:rPr>
-                <w:t>https://loginchurch.vercel.app/sunghwan</w:t>
+                <w:t>https://loginchurch.vercel.app/joy</w:t>
               </w:r>
             </w:hyperlink>
           </w:p>
@@ -1639,7 +1639,7 @@
               <w:rPr>
                 <w:rFonts w:ascii="Malgun Gothic" w:hAnsi="Malgun Gothic"/>
               </w:rPr>
-              <w:t>조이 성도</w:t>
+              <w:t>최지혜 집사</w:t>
             </w:r>
           </w:p>
         </w:tc>
@@ -1654,7 +1654,7 @@
                   <w:color w:val="0000FF"/>
                   <w:u w:val="single"/>
                 </w:rPr>
-                <w:t>https://loginchurch.vercel.app/joy</w:t>
+                <w:t>https://loginchurch.vercel.app/jihye</w:t>
               </w:r>
             </w:hyperlink>
           </w:p>
@@ -1683,7 +1683,7 @@
               <w:rPr>
                 <w:rFonts w:ascii="Malgun Gothic" w:hAnsi="Malgun Gothic"/>
               </w:rPr>
-              <w:t>최지혜 집사</w:t>
+              <w:t>최현경 권사</w:t>
             </w:r>
           </w:p>
         </w:tc>
@@ -1693,50 +1693,6 @@
           </w:tcPr>
           <w:p>
             <w:hyperlink r:id="rId45">
-              <w:r>
-                <w:rPr>
-                  <w:color w:val="0000FF"/>
-                  <w:u w:val="single"/>
-                </w:rPr>
-                <w:t>https://loginchurch.vercel.app/jihye</w:t>
-              </w:r>
-            </w:hyperlink>
-          </w:p>
-        </w:tc>
-      </w:tr>
-      <w:tr>
-        <w:tc>
-          <w:tcPr>
-            <w:tcW w:type="dxa" w:w="2880"/>
-          </w:tcPr>
-          <w:p>
-            <w:r>
-              <w:rPr>
-                <w:rFonts w:ascii="Malgun Gothic" w:hAnsi="Malgun Gothic"/>
-              </w:rPr>
-              <w:t>38</w:t>
-            </w:r>
-          </w:p>
-        </w:tc>
-        <w:tc>
-          <w:tcPr>
-            <w:tcW w:type="dxa" w:w="2880"/>
-          </w:tcPr>
-          <w:p>
-            <w:r>
-              <w:rPr>
-                <w:rFonts w:ascii="Malgun Gothic" w:hAnsi="Malgun Gothic"/>
-              </w:rPr>
-              <w:t>최현경 권사</w:t>
-            </w:r>
-          </w:p>
-        </w:tc>
-        <w:tc>
-          <w:tcPr>
-            <w:tcW w:type="dxa" w:w="2880"/>
-          </w:tcPr>
-          <w:p>
-            <w:hyperlink r:id="rId46">
               <w:r>
                 <w:rPr>
                   <w:color w:val="0000FF"/>

</xml_diff>